<commit_message>
ASGARDIAN CONTINUITY PROTOCOL: Audit Hub v28.0 stabilized and records synced
</commit_message>
<xml_diff>
--- a/report_Benowa_Hills_ELC_2026-05-08.docx
+++ b/report_Benowa_Hills_ELC_2026-05-08.docx
@@ -7,17 +7,7 @@
         <w:pStyle w:val="Title"/>
       </w:pPr>
       <w:r>
-        <w:t>Site Audit Report: Benowa Hills ELC</w:t>
-      </w:r>
-    </w:p>
-    <w:p>
-      <w:r>
-        <w:t>Date: 2026-05-08</w:t>
-      </w:r>
-    </w:p>
-    <w:p>
-      <w:r>
-        <w:t># Benowa Hills ELC</w:t>
+        <w:t>Benowa Hills ELC</w:t>
       </w:r>
     </w:p>
     <w:p>
@@ -27,8 +17,11 @@
     </w:p>
     <w:p/>
     <w:p>
+      <w:pPr>
+        <w:pStyle w:val="Heading1"/>
+      </w:pPr>
       <w:r>
-        <w:t>## Executive Summary</w:t>
+        <w:t>Executive Summary</w:t>
       </w:r>
     </w:p>
     <w:p>
@@ -43,19 +36,28 @@
     </w:p>
     <w:p/>
     <w:p>
+      <w:pPr>
+        <w:pStyle w:val="Heading1"/>
+      </w:pPr>
       <w:r>
-        <w:t>## Critical Incidents &amp; Immediate Actions</w:t>
+        <w:t>Critical Incidents &amp; Immediate Actions</w:t>
       </w:r>
     </w:p>
     <w:p/>
     <w:p>
+      <w:pPr>
+        <w:pStyle w:val="Heading1"/>
+      </w:pPr>
       <w:r>
-        <w:t>## Detailed Findings by Room / User</w:t>
+        <w:t>Detailed Findings by Room / User</w:t>
       </w:r>
     </w:p>
     <w:p>
+      <w:pPr>
+        <w:pStyle w:val="Heading2"/>
+      </w:pPr>
       <w:r>
-        <w:t>### Spare Office Upstairs</w:t>
+        <w:t>Spare Office Upstairs</w:t>
       </w:r>
     </w:p>
     <w:p>
@@ -84,8 +86,11 @@
       </w:r>
     </w:p>
     <w:p>
+      <w:pPr>
+        <w:pStyle w:val="Heading2"/>
+      </w:pPr>
       <w:r>
-        <w:t>### babies 1</w:t>
+        <w:t>babies 1</w:t>
       </w:r>
     </w:p>
     <w:p>
@@ -114,8 +119,11 @@
       </w:r>
     </w:p>
     <w:p>
+      <w:pPr>
+        <w:pStyle w:val="Heading2"/>
+      </w:pPr>
       <w:r>
-        <w:t>### BHELC Gym Music</w:t>
+        <w:t>BHELC Gym Music</w:t>
       </w:r>
     </w:p>
     <w:p>
@@ -144,8 +152,11 @@
       </w:r>
     </w:p>
     <w:p>
+      <w:pPr>
+        <w:pStyle w:val="Heading2"/>
+      </w:pPr>
       <w:r>
-        <w:t>### Kindergarten one</w:t>
+        <w:t>Kindergarten one</w:t>
       </w:r>
     </w:p>
     <w:p>
@@ -174,8 +185,11 @@
       </w:r>
     </w:p>
     <w:p>
+      <w:pPr>
+        <w:pStyle w:val="Heading2"/>
+      </w:pPr>
       <w:r>
-        <w:t>### Pre Kindy</w:t>
+        <w:t>Pre Kindy</w:t>
       </w:r>
     </w:p>
     <w:p>
@@ -204,8 +218,11 @@
       </w:r>
     </w:p>
     <w:p>
+      <w:pPr>
+        <w:pStyle w:val="Heading2"/>
+      </w:pPr>
       <w:r>
-        <w:t>### Toddlers One</w:t>
+        <w:t>Toddlers One</w:t>
       </w:r>
     </w:p>
     <w:p>
@@ -234,8 +251,11 @@
       </w:r>
     </w:p>
     <w:p>
+      <w:pPr>
+        <w:pStyle w:val="Heading2"/>
+      </w:pPr>
       <w:r>
-        <w:t>### BHELC Iphone Emergency</w:t>
+        <w:t>BHELC Iphone Emergency</w:t>
       </w:r>
     </w:p>
     <w:p>
@@ -264,8 +284,11 @@
       </w:r>
     </w:p>
     <w:p>
+      <w:pPr>
+        <w:pStyle w:val="Heading2"/>
+      </w:pPr>
       <w:r>
-        <w:t>### D Cartledge Simply ICT</w:t>
+        <w:t>D Cartledge Simply ICT</w:t>
       </w:r>
     </w:p>
     <w:p>
@@ -294,8 +317,11 @@
       </w:r>
     </w:p>
     <w:p>
+      <w:pPr>
+        <w:pStyle w:val="Heading2"/>
+      </w:pPr>
       <w:r>
-        <w:t>### Babies 1</w:t>
+        <w:t>Babies 1</w:t>
       </w:r>
     </w:p>
     <w:p>
@@ -324,8 +350,11 @@
       </w:r>
     </w:p>
     <w:p>
+      <w:pPr>
+        <w:pStyle w:val="Heading2"/>
+      </w:pPr>
       <w:r>
-        <w:t>### Babies 3</w:t>
+        <w:t>Babies 3</w:t>
       </w:r>
     </w:p>
     <w:p>
@@ -354,8 +383,11 @@
       </w:r>
     </w:p>
     <w:p>
+      <w:pPr>
+        <w:pStyle w:val="Heading2"/>
+      </w:pPr>
       <w:r>
-        <w:t>### Claire</w:t>
+        <w:t>Claire</w:t>
       </w:r>
     </w:p>
     <w:p>
@@ -384,8 +416,11 @@
       </w:r>
     </w:p>
     <w:p>
+      <w:pPr>
+        <w:pStyle w:val="Heading2"/>
+      </w:pPr>
       <w:r>
-        <w:t>### D Cartledge Simply ICT</w:t>
+        <w:t>D Cartledge Simply ICT</w:t>
       </w:r>
     </w:p>
     <w:p>
@@ -414,8 +449,11 @@
       </w:r>
     </w:p>
     <w:p>
+      <w:pPr>
+        <w:pStyle w:val="Heading2"/>
+      </w:pPr>
       <w:r>
-        <w:t>### Kindergarten Two</w:t>
+        <w:t>Kindergarten Two</w:t>
       </w:r>
     </w:p>
     <w:p>
@@ -444,8 +482,11 @@
       </w:r>
     </w:p>
     <w:p>
+      <w:pPr>
+        <w:pStyle w:val="Heading2"/>
+      </w:pPr>
       <w:r>
-        <w:t>### Senior Kindy</w:t>
+        <w:t>Senior Kindy</w:t>
       </w:r>
     </w:p>
     <w:p>
@@ -474,8 +515,11 @@
       </w:r>
     </w:p>
     <w:p>
+      <w:pPr>
+        <w:pStyle w:val="Heading2"/>
+      </w:pPr>
       <w:r>
-        <w:t>### Babies 2</w:t>
+        <w:t>Babies 2</w:t>
       </w:r>
     </w:p>
     <w:p>
@@ -504,8 +548,11 @@
       </w:r>
     </w:p>
     <w:p>
+      <w:pPr>
+        <w:pStyle w:val="Heading2"/>
+      </w:pPr>
       <w:r>
-        <w:t>### Babies 3</w:t>
+        <w:t>Babies 3</w:t>
       </w:r>
     </w:p>
     <w:p>
@@ -534,8 +581,11 @@
       </w:r>
     </w:p>
     <w:p>
+      <w:pPr>
+        <w:pStyle w:val="Heading2"/>
+      </w:pPr>
       <w:r>
-        <w:t>### Kindergarten One</w:t>
+        <w:t>Kindergarten One</w:t>
       </w:r>
     </w:p>
     <w:p>
@@ -564,8 +614,11 @@
       </w:r>
     </w:p>
     <w:p>
+      <w:pPr>
+        <w:pStyle w:val="Heading2"/>
+      </w:pPr>
       <w:r>
-        <w:t>### Kindy Music</w:t>
+        <w:t>Kindy Music</w:t>
       </w:r>
     </w:p>
     <w:p>
@@ -594,8 +647,11 @@
       </w:r>
     </w:p>
     <w:p>
+      <w:pPr>
+        <w:pStyle w:val="Heading2"/>
+      </w:pPr>
       <w:r>
-        <w:t>### Pre Kindy</w:t>
+        <w:t>Pre Kindy</w:t>
       </w:r>
     </w:p>
     <w:p>
@@ -624,8 +680,11 @@
       </w:r>
     </w:p>
     <w:p>
+      <w:pPr>
+        <w:pStyle w:val="Heading2"/>
+      </w:pPr>
       <w:r>
-        <w:t>### Reception Main Right</w:t>
+        <w:t>Reception Main Right</w:t>
       </w:r>
     </w:p>
     <w:p>
@@ -654,8 +713,11 @@
       </w:r>
     </w:p>
     <w:p>
+      <w:pPr>
+        <w:pStyle w:val="Heading2"/>
+      </w:pPr>
       <w:r>
-        <w:t>### Toddlers One</w:t>
+        <w:t>Toddlers One</w:t>
       </w:r>
     </w:p>
     <w:p>
@@ -684,8 +746,11 @@
       </w:r>
     </w:p>
     <w:p>
+      <w:pPr>
+        <w:pStyle w:val="Heading2"/>
+      </w:pPr>
       <w:r>
-        <w:t>### Kindergarten One</w:t>
+        <w:t>Kindergarten One</w:t>
       </w:r>
     </w:p>
     <w:p>
@@ -699,8 +764,11 @@
       </w:r>
     </w:p>
     <w:p>
+      <w:pPr>
+        <w:pStyle w:val="Heading2"/>
+      </w:pPr>
       <w:r>
-        <w:t>### Danielle</w:t>
+        <w:t>Danielle</w:t>
       </w:r>
     </w:p>
     <w:p>
@@ -729,8 +797,11 @@
       </w:r>
     </w:p>
     <w:p>
+      <w:pPr>
+        <w:pStyle w:val="Heading2"/>
+      </w:pPr>
       <w:r>
-        <w:t>### Russells Laptop</w:t>
+        <w:t>Russells Laptop</w:t>
       </w:r>
     </w:p>
     <w:p>
@@ -759,8 +830,11 @@
       </w:r>
     </w:p>
     <w:p>
+      <w:pPr>
+        <w:pStyle w:val="Heading2"/>
+      </w:pPr>
       <w:r>
-        <w:t>### Toddlers two</w:t>
+        <w:t>Toddlers two</w:t>
       </w:r>
     </w:p>
     <w:p>
@@ -789,8 +863,11 @@
       </w:r>
     </w:p>
     <w:p>
+      <w:pPr>
+        <w:pStyle w:val="Heading2"/>
+      </w:pPr>
       <w:r>
-        <w:t>### babies 2</w:t>
+        <w:t>babies 2</w:t>
       </w:r>
     </w:p>
     <w:p>
@@ -819,8 +896,11 @@
       </w:r>
     </w:p>
     <w:p>
+      <w:pPr>
+        <w:pStyle w:val="Heading2"/>
+      </w:pPr>
       <w:r>
-        <w:t>### Gym Reception</w:t>
+        <w:t>Gym Reception</w:t>
       </w:r>
     </w:p>
     <w:p>
@@ -849,8 +929,11 @@
       </w:r>
     </w:p>
     <w:p>
+      <w:pPr>
+        <w:pStyle w:val="Heading2"/>
+      </w:pPr>
       <w:r>
-        <w:t>### Kindergarten Two</w:t>
+        <w:t>Kindergarten Two</w:t>
       </w:r>
     </w:p>
     <w:p>
@@ -879,8 +962,11 @@
       </w:r>
     </w:p>
     <w:p>
+      <w:pPr>
+        <w:pStyle w:val="Heading2"/>
+      </w:pPr>
       <w:r>
-        <w:t>### KITCHEN</w:t>
+        <w:t>KITCHEN</w:t>
       </w:r>
     </w:p>
     <w:p>
@@ -909,8 +995,11 @@
       </w:r>
     </w:p>
     <w:p>
+      <w:pPr>
+        <w:pStyle w:val="Heading2"/>
+      </w:pPr>
       <w:r>
-        <w:t>### Reception Main Left</w:t>
+        <w:t>Reception Main Left</w:t>
       </w:r>
     </w:p>
     <w:p>
@@ -939,8 +1028,11 @@
       </w:r>
     </w:p>
     <w:p>
+      <w:pPr>
+        <w:pStyle w:val="Heading2"/>
+      </w:pPr>
       <w:r>
-        <w:t>### Senior Kindy</w:t>
+        <w:t>Senior Kindy</w:t>
       </w:r>
     </w:p>
     <w:p>
@@ -969,8 +1061,11 @@
       </w:r>
     </w:p>
     <w:p>
+      <w:pPr>
+        <w:pStyle w:val="Heading2"/>
+      </w:pPr>
       <w:r>
-        <w:t>### Toddlers two</w:t>
+        <w:t>Toddlers two</w:t>
       </w:r>
     </w:p>
     <w:p>
@@ -999,8 +1094,11 @@
       </w:r>
     </w:p>
     <w:p>
+      <w:pPr>
+        <w:pStyle w:val="Heading2"/>
+      </w:pPr>
       <w:r>
-        <w:t>### Kindergarten Two</w:t>
+        <w:t>Kindergarten Two</w:t>
       </w:r>
     </w:p>
     <w:p>
@@ -1015,8 +1113,11 @@
     </w:p>
     <w:p/>
     <w:p>
+      <w:pPr>
+        <w:pStyle w:val="Heading1"/>
+      </w:pPr>
       <w:r>
-        <w:t>## Missing Assets Register</w:t>
+        <w:t>Missing Assets Register</w:t>
       </w:r>
     </w:p>
     <w:sectPr>

</xml_diff>